<commit_message>
Tracetabellen Welt 5: Level-Order mit „// → Tabellenzeile“ markiert (AB1, Folie, Warm-up W5-09, Lab W5-L3-05)
Co-Authored-By: Claude Opus 5.5 <noreply@anthropic.com>
Claude-Session: https://claude.ai/code/session_01CemoEYGRdCe5FszEBVFFUP
</commit_message>
<xml_diff>
--- a/materialien/Welt5_Wald/2_Arbeitsblaetter/AQ_W5_AB1_Binaerbaeume.docx
+++ b/materialien/Welt5_Wald/2_Arbeitsblaetter/AQ_W5_AB1_Binaerbaeume.docx
@@ -21586,6 +21586,15 @@
                     </w:rPr>
                     <w:t xml:space="preserve">    }</w:t>
                   </w:r>
+                  <w:r>
+                    <w:rPr>
+                      <w:rFonts w:ascii="Consolas" w:cs="Consolas" w:eastAsia="Consolas" w:hAnsi="Consolas"/>
+                      <w:color w:val="5F7F5F"/>
+                      <w:sz w:val="17"/>
+                      <w:szCs w:val="17"/>
+                    </w:rPr>
+                    <w:t xml:space="preserve">   // → Tabellenzeile (Startwerte)</w:t>
+                  </w:r>
                 </w:p>
                 <w:p>
                   <w:pPr>
@@ -21810,6 +21819,15 @@
                       <w:szCs w:val="17"/>
                     </w:rPr>
                     <w:t xml:space="preserve">        }</w:t>
+                  </w:r>
+                  <w:r>
+                    <w:rPr>
+                      <w:rFonts w:ascii="Consolas" w:cs="Consolas" w:eastAsia="Consolas" w:hAnsi="Consolas"/>
+                      <w:color w:val="5F7F5F"/>
+                      <w:sz w:val="17"/>
+                      <w:szCs w:val="17"/>
+                    </w:rPr>
+                    <w:t xml:space="preserve">   // → Tabellenzeile</w:t>
                   </w:r>
                 </w:p>
                 <w:p>
@@ -21987,7 +22005,7 @@
                       <w:sz w:val="22"/>
                       <w:szCs w:val="22"/>
                     </w:rPr>
-                    <w:t xml:space="preserve"> aus. Notiere nach jedem Schleifendurchlauf den entnommenen Knoten, den Wert von text und den Inhalt der Schlange (vorne zuerst; jeden Teilbaum gibst du durch seinen Wurzelwert an).</w:t>
+                    <w:t xml:space="preserve"> aus. Notiere an jeder mit „// → Tabellenzeile“ markierten Stelle (vor der Schleife und am Ende jedes Durchlaufs) den entnommenen Knoten, den Wert von text und den Inhalt der Schlange (vorne zuerst; jeden Teilbaum gibst du durch seinen Wurzelwert an).</w:t>
                   </w:r>
                 </w:p>
               </w:tc>

</xml_diff>